<commit_message>
ready to publish to testflight
</commit_message>
<xml_diff>
--- a/Parkeasy Notes.docx
+++ b/Parkeasy Notes.docx
@@ -718,12 +718,30 @@
       <w:r>
         <w:t>21.34 USD -&gt; 28.86 CAD)</w:t>
       </w:r>
+      <w:r>
+        <w:t xml:space="preserve"> - reimbursed</w:t>
+      </w:r>
     </w:p>
     <w:p>
       <w:r>
         <w:t>Apple developer account (119 CAD)</w:t>
       </w:r>
-    </w:p>
+      <w:r>
+        <w:t xml:space="preserve"> – reimbursed</w:t>
+      </w:r>
+    </w:p>
+    <w:p>
+      <w:r>
+        <w:t>Google Play Console Developer Account(</w:t>
+      </w:r>
+      <w:r>
+        <w:t>25usd</w:t>
+      </w:r>
+      <w:r>
+        <w:t>)</w:t>
+      </w:r>
+    </w:p>
+    <w:p/>
     <w:sectPr>
       <w:pgSz w:w="12240" w:h="15840"/>
       <w:pgMar w:top="1440" w:right="1440" w:bottom="1440" w:left="1440" w:header="708" w:footer="708" w:gutter="0"/>

</xml_diff>